<commit_message>
Newcomer guide: remove meeting venue and contact name; add lang attributes site-wide
</commit_message>
<xml_diff>
--- a/files/LOMS_Newcomer_Guide_CN.docx
+++ b/files/LOMS_Newcomer_Guide_CN.docx
@@ -12970,80 +12970,7 @@
       </w:pPr>
       <w:r>
         <w:rPr/>
-        <w:t>组会时间</w:t>
-      </w:r>
-      <w:r>
-        <w:rPr>
-          <w:rFonts w:hint="eastAsia"/>
-          <w:lang w:eastAsia="zh-CN"/>
-        </w:rPr>
-        <w:t>为每周五下午</w:t>
-      </w:r>
-      <w:r>
-        <w:rPr>
-          <w:rFonts w:hint="eastAsia"/>
-          <w:lang w:eastAsia="zh-CN"/>
-        </w:rPr>
-        <w:t>1</w:t>
-      </w:r>
-      <w:r>
-        <w:rPr>
-          <w:lang w:eastAsia="zh-CN"/>
-        </w:rPr>
-        <w:t>6:00</w:t>
-      </w:r>
-      <w:r>
-        <w:rPr/>
-        <w:t>、</w:t>
-      </w:r>
-      <w:r>
-        <w:rPr>
-          <w:rFonts w:hint="eastAsia"/>
-          <w:lang w:eastAsia="zh-CN"/>
-        </w:rPr>
-        <w:t>主楼</w:t>
-      </w:r>
-      <w:r>
-        <w:rPr>
-          <w:rFonts w:hint="eastAsia"/>
-          <w:lang w:eastAsia="zh-CN"/>
-        </w:rPr>
-        <w:t>4</w:t>
-      </w:r>
-      <w:r>
-        <w:rPr>
-          <w:lang w:eastAsia="zh-CN"/>
-        </w:rPr>
-        <w:t>71</w:t>
-      </w:r>
-      <w:r>
-        <w:rPr>
-          <w:rFonts w:hint="eastAsia"/>
-          <w:lang w:eastAsia="zh-CN"/>
-        </w:rPr>
-        <w:t>和</w:t>
-      </w:r>
-      <w:r>
-        <w:rPr/>
-        <w:t>线上平台</w:t>
-      </w:r>
-      <w:r>
-        <w:rPr>
-          <w:rFonts w:hint="eastAsia"/>
-          <w:lang w:eastAsia="zh-CN"/>
-        </w:rPr>
-        <w:t>同步</w:t>
-      </w:r>
-      <w:r>
-        <w:rPr/>
-        <w:t>、汇报轮值</w:t>
-      </w:r>
-      <w:r>
-        <w:rPr>
-          <w:rFonts w:hint="eastAsia"/>
-          <w:lang w:eastAsia="zh-CN"/>
-        </w:rPr>
-        <w:t>顺序表见内部文档。</w:t>
+        <w:t>组会的具体时间、地点与形式请联系PI，汇报轮值顺序表见内部文档。</w:t>
       </w:r>
     </w:p>
     <w:p>
@@ -13178,45 +13105,7 @@
       </w:pPr>
       <w:r>
         <w:rPr/>
-        <w:t>请假</w:t>
-      </w:r>
-      <w:r>
-        <w:rPr>
-          <w:rFonts w:hint="eastAsia"/>
-          <w:lang w:eastAsia="zh-CN"/>
-        </w:rPr>
-        <w:t>联系</w:t>
-      </w:r>
-      <w:r>
-        <w:rPr>
-          <w:rFonts w:hint="eastAsia"/>
-          <w:lang w:eastAsia="zh-CN"/>
-        </w:rPr>
-        <w:t>P</w:t>
-      </w:r>
-      <w:r>
-        <w:rPr>
-          <w:lang w:eastAsia="zh-CN"/>
-        </w:rPr>
-        <w:t>I</w:t>
-      </w:r>
-      <w:r>
-        <w:rPr>
-          <w:rFonts w:hint="eastAsia"/>
-          <w:lang w:eastAsia="zh-CN"/>
-        </w:rPr>
-        <w:t>，参会及</w:t>
-      </w:r>
-      <w:r>
-        <w:rPr/>
-        <w:t>出差报销流程</w:t>
-      </w:r>
-      <w:r>
-        <w:rPr>
-          <w:rFonts w:hint="eastAsia"/>
-          <w:lang w:eastAsia="zh-CN"/>
-        </w:rPr>
-        <w:t>请联系张萌。</w:t>
+        <w:t>请假及参会、出差报销流程请联系PI。</w:t>
       </w:r>
     </w:p>
     <w:p>

</xml_diff>